<commit_message>
Atualiza README e CITATION.cff com DOI v1.0.1
</commit_message>
<xml_diff>
--- a/manual/Metodo_ORP_Edicao_Generica_v2.docx
+++ b/manual/Metodo_ORP_Edicao_Generica_v2.docx
@@ -354,7 +354,26 @@
           <w:i/>
           <w:iCs/>
         </w:rPr>
-        <w:t xml:space="preserve">PEREIRA, Kerson Kleber Espínola. Método ORP – Observar, Relacionar e Produzir. Versão 1.0. 2026.</w:t>
+        <w:t xml:space="preserve">Pereira, K. K. E. (2026). Método ORP — Observar, Relacionar e Produzir: Organização da Pesquisa Científica com Inteligência Artificial (Version v1.0.1) [Computer software]. Zenodo. https://doi.org/10.5281/zenodo.21367100</w:t>
+      </w:r>
+    </w:p>
+    <w:p>
+      <w:pPr>
+        <w:pStyle w:val="Normal"/>
+        <w:spacing w:before="0" w:after="80"/>
+        <w:rPr/>
+      </w:pPr>
+      <w:r>
+        <w:rPr>
+          <w:b/>
+          <w:bCs/>
+          <w:color w:val="1F3864"/>
+        </w:rPr>
+        <w:t xml:space="preserve">DOI: </w:t>
+      </w:r>
+      <w:r>
+        <w:rPr/>
+        <w:t xml:space="preserve">10.5281/zenodo.21367100 — https://doi.org/10.5281/zenodo.21367100</w:t>
       </w:r>
     </w:p>
     <w:p>

</xml_diff>

<commit_message>
Atualização com o ORCID
</commit_message>
<xml_diff>
--- a/manual/Metodo_ORP_Edicao_Generica_v2.docx
+++ b/manual/Metodo_ORP_Edicao_Generica_v2.docx
@@ -379,6 +379,25 @@
     <w:p>
       <w:pPr>
         <w:pStyle w:val="Normal"/>
+        <w:spacing w:before="0" w:after="80"/>
+        <w:rPr/>
+      </w:pPr>
+      <w:r>
+        <w:rPr>
+          <w:b/>
+          <w:bCs/>
+          <w:color w:val="1F3864"/>
+        </w:rPr>
+        <w:t xml:space="preserve">ORCID iD: </w:t>
+      </w:r>
+      <w:r>
+        <w:rPr/>
+        <w:t xml:space="preserve">0000-0001-8556-4195</w:t>
+      </w:r>
+    </w:p>
+    <w:p>
+      <w:pPr>
+        <w:pStyle w:val="Normal"/>
         <w:spacing w:before="0" w:after="0"/>
         <w:rPr/>
       </w:pPr>
@@ -3834,18 +3853,7 @@
           <w:sz w:val="20"/>
           <w:szCs w:val="20"/>
         </w:rPr>
-        <w:t xml:space="preserve">   </w:t>
-      </w:r>
-      <w:r>
-        <w:rPr>
-          <w:rFonts w:eastAsia="Consolas" w:cs="Consolas" w:ascii="Consolas" w:hAnsi="Consolas"/>
-          <w:i w:val="false"/>
-          <w:iCs w:val="false"/>
-          <w:color w:val="202020"/>
-          <w:sz w:val="20"/>
-          <w:szCs w:val="20"/>
-        </w:rPr>
-        <w:t>teórica geral (macroteoria) deste eixo?</w:t>
+        <w:t xml:space="preserve">   teórica geral (macroteoria) deste eixo?</w:t>
       </w:r>
     </w:p>
     <w:p>
@@ -3885,18 +3893,7 @@
           <w:sz w:val="20"/>
           <w:szCs w:val="20"/>
         </w:rPr>
-        <w:t xml:space="preserve">   </w:t>
-      </w:r>
-      <w:r>
-        <w:rPr>
-          <w:rFonts w:eastAsia="Consolas" w:cs="Consolas" w:ascii="Consolas" w:hAnsi="Consolas"/>
-          <w:i w:val="false"/>
-          <w:iCs w:val="false"/>
-          <w:color w:val="202020"/>
-          <w:sz w:val="20"/>
-          <w:szCs w:val="20"/>
-        </w:rPr>
-        <w:t>central deste eixo?</w:t>
+        <w:t xml:space="preserve">   central deste eixo?</w:t>
       </w:r>
     </w:p>
     <w:p>
@@ -4510,18 +4507,7 @@
           <w:sz w:val="20"/>
           <w:szCs w:val="20"/>
         </w:rPr>
-        <w:t xml:space="preserve">   </w:t>
-      </w:r>
-      <w:r>
-        <w:rPr>
-          <w:rFonts w:eastAsia="Consolas" w:cs="Consolas" w:ascii="Consolas" w:hAnsi="Consolas"/>
-          <w:i w:val="false"/>
-          <w:iCs w:val="false"/>
-          <w:color w:val="202020"/>
-          <w:sz w:val="20"/>
-          <w:szCs w:val="20"/>
-        </w:rPr>
-        <w:t>histórico | Mudança de enfoque (se houver).</w:t>
+        <w:t xml:space="preserve">   histórico | Mudança de enfoque (se houver).</w:t>
       </w:r>
     </w:p>
     <w:p>
@@ -4573,111 +4559,67 @@
           <w:sz w:val="20"/>
           <w:szCs w:val="20"/>
         </w:rPr>
-        <w:t xml:space="preserve">   </w:t>
-      </w:r>
-      <w:r>
-        <w:rPr>
-          <w:rFonts w:eastAsia="Consolas" w:cs="Consolas" w:ascii="Consolas" w:hAnsi="Consolas"/>
-          <w:i w:val="false"/>
-          <w:iCs w:val="false"/>
-          <w:color w:val="202020"/>
-          <w:sz w:val="20"/>
-          <w:szCs w:val="20"/>
-        </w:rPr>
-        <w:t>currículo/norma prescrita" pelas instituições ou pelo Estado na</w:t>
-      </w:r>
-    </w:p>
-    <w:p>
-      <w:pPr>
-        <w:pStyle w:val="Normal"/>
-        <w:shd w:val="clear" w:fill="F2F2F2"/>
-        <w:spacing w:before="0" w:after="0"/>
-        <w:ind w:start="200" w:end="200"/>
-        <w:rPr/>
-      </w:pPr>
-      <w:r>
-        <w:rPr>
-          <w:rFonts w:eastAsia="Consolas" w:cs="Consolas" w:ascii="Consolas" w:hAnsi="Consolas"/>
-          <w:i w:val="false"/>
-          <w:iCs w:val="false"/>
-          <w:color w:val="202020"/>
-          <w:sz w:val="20"/>
-          <w:szCs w:val="20"/>
-        </w:rPr>
-        <w:t xml:space="preserve">   </w:t>
-      </w:r>
-      <w:r>
-        <w:rPr>
-          <w:rFonts w:eastAsia="Consolas" w:cs="Consolas" w:ascii="Consolas" w:hAnsi="Consolas"/>
-          <w:i w:val="false"/>
-          <w:iCs w:val="false"/>
-          <w:color w:val="202020"/>
-          <w:sz w:val="20"/>
-          <w:szCs w:val="20"/>
-        </w:rPr>
-        <w:t>época; do outro, as "práticas reais e resistências informais"</w:t>
-      </w:r>
-    </w:p>
-    <w:p>
-      <w:pPr>
-        <w:pStyle w:val="Normal"/>
-        <w:shd w:val="clear" w:fill="F2F2F2"/>
-        <w:spacing w:before="0" w:after="0"/>
-        <w:ind w:start="200" w:end="200"/>
-        <w:rPr/>
-      </w:pPr>
-      <w:r>
-        <w:rPr>
-          <w:rFonts w:eastAsia="Consolas" w:cs="Consolas" w:ascii="Consolas" w:hAnsi="Consolas"/>
-          <w:i w:val="false"/>
-          <w:iCs w:val="false"/>
-          <w:color w:val="202020"/>
-          <w:sz w:val="20"/>
-          <w:szCs w:val="20"/>
-        </w:rPr>
-        <w:t xml:space="preserve">   </w:t>
-      </w:r>
-      <w:r>
-        <w:rPr>
-          <w:rFonts w:eastAsia="Consolas" w:cs="Consolas" w:ascii="Consolas" w:hAnsi="Consolas"/>
-          <w:i w:val="false"/>
-          <w:iCs w:val="false"/>
-          <w:color w:val="202020"/>
-          <w:sz w:val="20"/>
-          <w:szCs w:val="20"/>
-        </w:rPr>
-        <w:t>dos sujeitos que viviam aquele período — sempre que as fontes</w:t>
-      </w:r>
-    </w:p>
-    <w:p>
-      <w:pPr>
-        <w:pStyle w:val="Normal"/>
-        <w:shd w:val="clear" w:fill="F2F2F2"/>
-        <w:spacing w:before="0" w:after="0"/>
-        <w:ind w:start="200" w:end="200"/>
-        <w:rPr/>
-      </w:pPr>
-      <w:r>
-        <w:rPr>
-          <w:rFonts w:eastAsia="Consolas" w:cs="Consolas" w:ascii="Consolas" w:hAnsi="Consolas"/>
-          <w:i w:val="false"/>
-          <w:iCs w:val="false"/>
-          <w:color w:val="202020"/>
-          <w:sz w:val="20"/>
-          <w:szCs w:val="20"/>
-        </w:rPr>
-        <w:t xml:space="preserve">   </w:t>
-      </w:r>
-      <w:r>
-        <w:rPr>
-          <w:rFonts w:eastAsia="Consolas" w:cs="Consolas" w:ascii="Consolas" w:hAnsi="Consolas"/>
-          <w:i w:val="false"/>
-          <w:iCs w:val="false"/>
-          <w:color w:val="202020"/>
-          <w:sz w:val="20"/>
-          <w:szCs w:val="20"/>
-        </w:rPr>
-        <w:t>permitirem essa distinção.</w:t>
+        <w:t xml:space="preserve">   currículo/norma prescrita" pelas instituições ou pelo Estado na</w:t>
+      </w:r>
+    </w:p>
+    <w:p>
+      <w:pPr>
+        <w:pStyle w:val="Normal"/>
+        <w:shd w:val="clear" w:fill="F2F2F2"/>
+        <w:spacing w:before="0" w:after="0"/>
+        <w:ind w:start="200" w:end="200"/>
+        <w:rPr/>
+      </w:pPr>
+      <w:r>
+        <w:rPr>
+          <w:rFonts w:eastAsia="Consolas" w:cs="Consolas" w:ascii="Consolas" w:hAnsi="Consolas"/>
+          <w:i w:val="false"/>
+          <w:iCs w:val="false"/>
+          <w:color w:val="202020"/>
+          <w:sz w:val="20"/>
+          <w:szCs w:val="20"/>
+        </w:rPr>
+        <w:t xml:space="preserve">   época; do outro, as "práticas reais e resistências informais"</w:t>
+      </w:r>
+    </w:p>
+    <w:p>
+      <w:pPr>
+        <w:pStyle w:val="Normal"/>
+        <w:shd w:val="clear" w:fill="F2F2F2"/>
+        <w:spacing w:before="0" w:after="0"/>
+        <w:ind w:start="200" w:end="200"/>
+        <w:rPr/>
+      </w:pPr>
+      <w:r>
+        <w:rPr>
+          <w:rFonts w:eastAsia="Consolas" w:cs="Consolas" w:ascii="Consolas" w:hAnsi="Consolas"/>
+          <w:i w:val="false"/>
+          <w:iCs w:val="false"/>
+          <w:color w:val="202020"/>
+          <w:sz w:val="20"/>
+          <w:szCs w:val="20"/>
+        </w:rPr>
+        <w:t xml:space="preserve">   dos sujeitos que viviam aquele período — sempre que as fontes</w:t>
+      </w:r>
+    </w:p>
+    <w:p>
+      <w:pPr>
+        <w:pStyle w:val="Normal"/>
+        <w:shd w:val="clear" w:fill="F2F2F2"/>
+        <w:spacing w:before="0" w:after="0"/>
+        <w:ind w:start="200" w:end="200"/>
+        <w:rPr/>
+      </w:pPr>
+      <w:r>
+        <w:rPr>
+          <w:rFonts w:eastAsia="Consolas" w:cs="Consolas" w:ascii="Consolas" w:hAnsi="Consolas"/>
+          <w:i w:val="false"/>
+          <w:iCs w:val="false"/>
+          <w:color w:val="202020"/>
+          <w:sz w:val="20"/>
+          <w:szCs w:val="20"/>
+        </w:rPr>
+        <w:t xml:space="preserve">   permitirem essa distinção.</w:t>
       </w:r>
     </w:p>
     <w:p>
@@ -5178,18 +5120,7 @@
           <w:sz w:val="20"/>
           <w:szCs w:val="20"/>
         </w:rPr>
-        <w:t xml:space="preserve">   </w:t>
-      </w:r>
-      <w:r>
-        <w:rPr>
-          <w:rFonts w:eastAsia="Consolas" w:cs="Consolas" w:ascii="Consolas" w:hAnsi="Consolas"/>
-          <w:i w:val="false"/>
-          <w:iCs w:val="false"/>
-          <w:color w:val="202020"/>
-          <w:sz w:val="20"/>
-          <w:szCs w:val="20"/>
-        </w:rPr>
-        <w:t>futuras" por mais de um autor;</w:t>
+        <w:t xml:space="preserve">   futuras" por mais de um autor;</w:t>
       </w:r>
     </w:p>
     <w:p>
@@ -5229,18 +5160,7 @@
           <w:sz w:val="20"/>
           <w:szCs w:val="20"/>
         </w:rPr>
-        <w:t xml:space="preserve">   </w:t>
-      </w:r>
-      <w:r>
-        <w:rPr>
-          <w:rFonts w:eastAsia="Consolas" w:cs="Consolas" w:ascii="Consolas" w:hAnsi="Consolas"/>
-          <w:i w:val="false"/>
-          <w:iCs w:val="false"/>
-          <w:color w:val="202020"/>
-          <w:sz w:val="20"/>
-          <w:szCs w:val="20"/>
-        </w:rPr>
-        <w:t>conjunto aborda diretamente (lacuna por ausência).</w:t>
+        <w:t xml:space="preserve">   conjunto aborda diretamente (lacuna por ausência).</w:t>
       </w:r>
     </w:p>
     <w:p>
@@ -6150,15 +6070,7 @@
           <w:bCs/>
           <w:color w:val="FFFFFF"/>
         </w:rPr>
-        <w:t xml:space="preserve">  </w:t>
-      </w:r>
-      <w:r>
-        <w:rPr>
-          <w:b/>
-          <w:bCs/>
-          <w:color w:val="FFFFFF"/>
-        </w:rPr>
-        <w:t xml:space="preserve">EXEMPLO / MOCK ILUSTRATIVO  </w:t>
+        <w:t xml:space="preserve">  EXEMPLO / MOCK ILUSTRATIVO  </w:t>
       </w:r>
     </w:p>
     <w:p>
@@ -6405,18 +6317,7 @@
           <w:sz w:val="20"/>
           <w:szCs w:val="20"/>
         </w:rPr>
-        <w:t xml:space="preserve">  </w:t>
-      </w:r>
-      <w:r>
-        <w:rPr>
-          <w:rFonts w:eastAsia="Consolas" w:cs="Consolas" w:ascii="Consolas" w:hAnsi="Consolas"/>
-          <w:i/>
-          <w:iCs/>
-          <w:color w:val="C0392B"/>
-          <w:sz w:val="20"/>
-          <w:szCs w:val="20"/>
-        </w:rPr>
-        <w:t>a presença do grupo estudado, mesmo sem nomeá-lo diretamente.</w:t>
+        <w:t xml:space="preserve">  a presença do grupo estudado, mesmo sem nomeá-lo diretamente.</w:t>
       </w:r>
     </w:p>
     <w:p>
@@ -7037,49 +6938,27 @@
           <w:sz w:val="20"/>
           <w:szCs w:val="20"/>
         </w:rPr>
-        <w:t xml:space="preserve">   </w:t>
-      </w:r>
-      <w:r>
-        <w:rPr>
-          <w:rFonts w:eastAsia="Consolas" w:cs="Consolas" w:ascii="Consolas" w:hAnsi="Consolas"/>
-          <w:i w:val="false"/>
-          <w:iCs w:val="false"/>
-          <w:color w:val="202020"/>
-          <w:sz w:val="20"/>
-          <w:szCs w:val="20"/>
-        </w:rPr>
-        <w:t>fortalecem entre os eixos, especialmente: [conceito central 1],</w:t>
-      </w:r>
-    </w:p>
-    <w:p>
-      <w:pPr>
-        <w:pStyle w:val="Normal"/>
-        <w:shd w:val="clear" w:fill="F2F2F2"/>
-        <w:spacing w:before="0" w:after="0"/>
-        <w:ind w:start="200" w:end="200"/>
-        <w:rPr/>
-      </w:pPr>
-      <w:r>
-        <w:rPr>
-          <w:rFonts w:eastAsia="Consolas" w:cs="Consolas" w:ascii="Consolas" w:hAnsi="Consolas"/>
-          <w:i w:val="false"/>
-          <w:iCs w:val="false"/>
-          <w:color w:val="202020"/>
-          <w:sz w:val="20"/>
-          <w:szCs w:val="20"/>
-        </w:rPr>
-        <w:t xml:space="preserve">   </w:t>
-      </w:r>
-      <w:r>
-        <w:rPr>
-          <w:rFonts w:eastAsia="Consolas" w:cs="Consolas" w:ascii="Consolas" w:hAnsi="Consolas"/>
-          <w:i w:val="false"/>
-          <w:iCs w:val="false"/>
-          <w:color w:val="202020"/>
-          <w:sz w:val="20"/>
-          <w:szCs w:val="20"/>
-        </w:rPr>
-        <w:t>[conceito central 2], [conceito central 3].</w:t>
+        <w:t xml:space="preserve">   fortalecem entre os eixos, especialmente: [conceito central 1],</w:t>
+      </w:r>
+    </w:p>
+    <w:p>
+      <w:pPr>
+        <w:pStyle w:val="Normal"/>
+        <w:shd w:val="clear" w:fill="F2F2F2"/>
+        <w:spacing w:before="0" w:after="0"/>
+        <w:ind w:start="200" w:end="200"/>
+        <w:rPr/>
+      </w:pPr>
+      <w:r>
+        <w:rPr>
+          <w:rFonts w:eastAsia="Consolas" w:cs="Consolas" w:ascii="Consolas" w:hAnsi="Consolas"/>
+          <w:i w:val="false"/>
+          <w:iCs w:val="false"/>
+          <w:color w:val="202020"/>
+          <w:sz w:val="20"/>
+          <w:szCs w:val="20"/>
+        </w:rPr>
+        <w:t xml:space="preserve">   [conceito central 2], [conceito central 3].</w:t>
       </w:r>
     </w:p>
     <w:p>
@@ -7119,49 +6998,27 @@
           <w:sz w:val="20"/>
           <w:szCs w:val="20"/>
         </w:rPr>
-        <w:t xml:space="preserve">   </w:t>
-      </w:r>
-      <w:r>
-        <w:rPr>
-          <w:rFonts w:eastAsia="Consolas" w:cs="Consolas" w:ascii="Consolas" w:hAnsi="Consolas"/>
-          <w:i w:val="false"/>
-          <w:iCs w:val="false"/>
-          <w:color w:val="202020"/>
-          <w:sz w:val="20"/>
-          <w:szCs w:val="20"/>
-        </w:rPr>
-        <w:t>pesquisa geral, indicando quais aparecem como base recorrente</w:t>
-      </w:r>
-    </w:p>
-    <w:p>
-      <w:pPr>
-        <w:pStyle w:val="Normal"/>
-        <w:shd w:val="clear" w:fill="F2F2F2"/>
-        <w:spacing w:before="0" w:after="0"/>
-        <w:ind w:start="200" w:end="200"/>
-        <w:rPr/>
-      </w:pPr>
-      <w:r>
-        <w:rPr>
-          <w:rFonts w:eastAsia="Consolas" w:cs="Consolas" w:ascii="Consolas" w:hAnsi="Consolas"/>
-          <w:i w:val="false"/>
-          <w:iCs w:val="false"/>
-          <w:color w:val="202020"/>
-          <w:sz w:val="20"/>
-          <w:szCs w:val="20"/>
-        </w:rPr>
-        <w:t xml:space="preserve">   </w:t>
-      </w:r>
-      <w:r>
-        <w:rPr>
-          <w:rFonts w:eastAsia="Consolas" w:cs="Consolas" w:ascii="Consolas" w:hAnsi="Consolas"/>
-          <w:i w:val="false"/>
-          <w:iCs w:val="false"/>
-          <w:color w:val="202020"/>
-          <w:sz w:val="20"/>
-          <w:szCs w:val="20"/>
-        </w:rPr>
-        <w:t>entre eixos e quais são mais decisivos para o argumento central.</w:t>
+        <w:t xml:space="preserve">   pesquisa geral, indicando quais aparecem como base recorrente</w:t>
+      </w:r>
+    </w:p>
+    <w:p>
+      <w:pPr>
+        <w:pStyle w:val="Normal"/>
+        <w:shd w:val="clear" w:fill="F2F2F2"/>
+        <w:spacing w:before="0" w:after="0"/>
+        <w:ind w:start="200" w:end="200"/>
+        <w:rPr/>
+      </w:pPr>
+      <w:r>
+        <w:rPr>
+          <w:rFonts w:eastAsia="Consolas" w:cs="Consolas" w:ascii="Consolas" w:hAnsi="Consolas"/>
+          <w:i w:val="false"/>
+          <w:iCs w:val="false"/>
+          <w:color w:val="202020"/>
+          <w:sz w:val="20"/>
+          <w:szCs w:val="20"/>
+        </w:rPr>
+        <w:t xml:space="preserve">   entre eixos e quais são mais decisivos para o argumento central.</w:t>
       </w:r>
     </w:p>
     <w:p>
@@ -7201,18 +7058,7 @@
           <w:sz w:val="20"/>
           <w:szCs w:val="20"/>
         </w:rPr>
-        <w:t xml:space="preserve">   </w:t>
-      </w:r>
-      <w:r>
-        <w:rPr>
-          <w:rFonts w:eastAsia="Consolas" w:cs="Consolas" w:ascii="Consolas" w:hAnsi="Consolas"/>
-          <w:i w:val="false"/>
-          <w:iCs w:val="false"/>
-          <w:color w:val="202020"/>
-          <w:sz w:val="20"/>
-          <w:szCs w:val="20"/>
-        </w:rPr>
-        <w:t>eixos (não dentro de cada um isoladamente).</w:t>
+        <w:t xml:space="preserve">   eixos (não dentro de cada um isoladamente).</w:t>
       </w:r>
     </w:p>
     <w:p>
@@ -7252,49 +7098,27 @@
           <w:sz w:val="20"/>
           <w:szCs w:val="20"/>
         </w:rPr>
-        <w:t xml:space="preserve">   </w:t>
-      </w:r>
-      <w:r>
-        <w:rPr>
-          <w:rFonts w:eastAsia="Consolas" w:cs="Consolas" w:ascii="Consolas" w:hAnsi="Consolas"/>
-          <w:i w:val="false"/>
-          <w:iCs w:val="false"/>
-          <w:color w:val="202020"/>
-          <w:sz w:val="20"/>
-          <w:szCs w:val="20"/>
-        </w:rPr>
-        <w:t>[Nº máx.] fontes essenciais, equilibrando as diferentes bases</w:t>
-      </w:r>
-    </w:p>
-    <w:p>
-      <w:pPr>
-        <w:pStyle w:val="Normal"/>
-        <w:shd w:val="clear" w:fill="F2F2F2"/>
-        <w:spacing w:before="0" w:after="0"/>
-        <w:ind w:start="200" w:end="200"/>
-        <w:rPr/>
-      </w:pPr>
-      <w:r>
-        <w:rPr>
-          <w:rFonts w:eastAsia="Consolas" w:cs="Consolas" w:ascii="Consolas" w:hAnsi="Consolas"/>
-          <w:i w:val="false"/>
-          <w:iCs w:val="false"/>
-          <w:color w:val="202020"/>
-          <w:sz w:val="20"/>
-          <w:szCs w:val="20"/>
-        </w:rPr>
-        <w:t xml:space="preserve">   </w:t>
-      </w:r>
-      <w:r>
-        <w:rPr>
-          <w:rFonts w:eastAsia="Consolas" w:cs="Consolas" w:ascii="Consolas" w:hAnsi="Consolas"/>
-          <w:i w:val="false"/>
-          <w:iCs w:val="false"/>
-          <w:color w:val="202020"/>
-          <w:sz w:val="20"/>
-          <w:szCs w:val="20"/>
-        </w:rPr>
-        <w:t>teóricas envolvidas.</w:t>
+        <w:t xml:space="preserve">   [Nº máx.] fontes essenciais, equilibrando as diferentes bases</w:t>
+      </w:r>
+    </w:p>
+    <w:p>
+      <w:pPr>
+        <w:pStyle w:val="Normal"/>
+        <w:shd w:val="clear" w:fill="F2F2F2"/>
+        <w:spacing w:before="0" w:after="0"/>
+        <w:ind w:start="200" w:end="200"/>
+        <w:rPr/>
+      </w:pPr>
+      <w:r>
+        <w:rPr>
+          <w:rFonts w:eastAsia="Consolas" w:cs="Consolas" w:ascii="Consolas" w:hAnsi="Consolas"/>
+          <w:i w:val="false"/>
+          <w:iCs w:val="false"/>
+          <w:color w:val="202020"/>
+          <w:sz w:val="20"/>
+          <w:szCs w:val="20"/>
+        </w:rPr>
+        <w:t xml:space="preserve">   teóricas envolvidas.</w:t>
       </w:r>
     </w:p>
     <w:p>
@@ -8172,15 +7996,7 @@
           <w:bCs/>
           <w:color w:val="FFFFFF"/>
         </w:rPr>
-        <w:t xml:space="preserve">  </w:t>
-      </w:r>
-      <w:r>
-        <w:rPr>
-          <w:b/>
-          <w:bCs/>
-          <w:color w:val="FFFFFF"/>
-        </w:rPr>
-        <w:t xml:space="preserve">EXEMPLO / MOCK ILUSTRATIVO  </w:t>
+        <w:t xml:space="preserve">  EXEMPLO / MOCK ILUSTRATIVO  </w:t>
       </w:r>
     </w:p>
     <w:p>
@@ -8367,8 +8183,17 @@
           <w:sz w:val="20"/>
           <w:szCs w:val="20"/>
         </w:rPr>
-        <w:t xml:space="preserve">   </w:t>
-      </w:r>
+        <w:t xml:space="preserve">   foram encontradas em cada eixo;</w:t>
+      </w:r>
+    </w:p>
+    <w:p>
+      <w:pPr>
+        <w:pStyle w:val="Normal"/>
+        <w:shd w:val="clear" w:fill="F2F2F2"/>
+        <w:spacing w:before="0" w:after="0"/>
+        <w:ind w:start="200" w:end="200"/>
+        <w:rPr/>
+      </w:pPr>
       <w:r>
         <w:rPr>
           <w:rFonts w:eastAsia="Consolas" w:cs="Consolas" w:ascii="Consolas" w:hAnsi="Consolas"/>
@@ -8378,7 +8203,7 @@
           <w:sz w:val="20"/>
           <w:szCs w:val="20"/>
         </w:rPr>
-        <w:t>foram encontradas em cada eixo;</w:t>
+        <w:t>2) Em qual dos eixos o silêncio documental é mais evidente;</w:t>
       </w:r>
     </w:p>
     <w:p>
@@ -8398,7 +8223,7 @@
           <w:sz w:val="20"/>
           <w:szCs w:val="20"/>
         </w:rPr>
-        <w:t>2) Em qual dos eixos o silêncio documental é mais evidente;</w:t>
+        <w:t>3) Se há, mesmo que de forma indireta, vestígios sobre a</w:t>
       </w:r>
     </w:p>
     <w:p>
@@ -8418,38 +8243,7 @@
           <w:sz w:val="20"/>
           <w:szCs w:val="20"/>
         </w:rPr>
-        <w:t>3) Se há, mesmo que de forma indireta, vestígios sobre a</w:t>
-      </w:r>
-    </w:p>
-    <w:p>
-      <w:pPr>
-        <w:pStyle w:val="Normal"/>
-        <w:shd w:val="clear" w:fill="F2F2F2"/>
-        <w:spacing w:before="0" w:after="0"/>
-        <w:ind w:start="200" w:end="200"/>
-        <w:rPr/>
-      </w:pPr>
-      <w:r>
-        <w:rPr>
-          <w:rFonts w:eastAsia="Consolas" w:cs="Consolas" w:ascii="Consolas" w:hAnsi="Consolas"/>
-          <w:i/>
-          <w:iCs/>
-          <w:color w:val="C0392B"/>
-          <w:sz w:val="20"/>
-          <w:szCs w:val="20"/>
-        </w:rPr>
-        <w:t xml:space="preserve">   </w:t>
-      </w:r>
-      <w:r>
-        <w:rPr>
-          <w:rFonts w:eastAsia="Consolas" w:cs="Consolas" w:ascii="Consolas" w:hAnsi="Consolas"/>
-          <w:i/>
-          <w:iCs/>
-          <w:color w:val="C0392B"/>
-          <w:sz w:val="20"/>
-          <w:szCs w:val="20"/>
-        </w:rPr>
-        <w:t>existência do fenômeno pesquisado.</w:t>
+        <w:t xml:space="preserve">   existência do fenômeno pesquisado.</w:t>
       </w:r>
     </w:p>
     <w:p>
@@ -8872,18 +8666,7 @@
           <w:sz w:val="20"/>
           <w:szCs w:val="20"/>
         </w:rPr>
-        <w:t xml:space="preserve">   </w:t>
-      </w:r>
-      <w:r>
-        <w:rPr>
-          <w:rFonts w:eastAsia="Consolas" w:cs="Consolas" w:ascii="Consolas" w:hAnsi="Consolas"/>
-          <w:i w:val="false"/>
-          <w:iCs w:val="false"/>
-          <w:color w:val="202020"/>
-          <w:sz w:val="20"/>
-          <w:szCs w:val="20"/>
-        </w:rPr>
-        <w:t>um autor como "ponto em aberto";</w:t>
+        <w:t xml:space="preserve">   um autor como "ponto em aberto";</w:t>
       </w:r>
     </w:p>
     <w:p>
@@ -8923,18 +8706,7 @@
           <w:sz w:val="20"/>
           <w:szCs w:val="20"/>
         </w:rPr>
-        <w:t xml:space="preserve">   </w:t>
-      </w:r>
-      <w:r>
-        <w:rPr>
-          <w:rFonts w:eastAsia="Consolas" w:cs="Consolas" w:ascii="Consolas" w:hAnsi="Consolas"/>
-          <w:i w:val="false"/>
-          <w:iCs w:val="false"/>
-          <w:color w:val="202020"/>
-          <w:sz w:val="20"/>
-          <w:szCs w:val="20"/>
-        </w:rPr>
-        <w:t>"pesquisas futuras";</w:t>
+        <w:t xml:space="preserve">   "pesquisas futuras";</w:t>
       </w:r>
     </w:p>
     <w:p>
@@ -8974,18 +8746,7 @@
           <w:sz w:val="20"/>
           <w:szCs w:val="20"/>
         </w:rPr>
-        <w:t xml:space="preserve">   </w:t>
-      </w:r>
-      <w:r>
-        <w:rPr>
-          <w:rFonts w:eastAsia="Consolas" w:cs="Consolas" w:ascii="Consolas" w:hAnsi="Consolas"/>
-          <w:i w:val="false"/>
-          <w:iCs w:val="false"/>
-          <w:color w:val="202020"/>
-          <w:sz w:val="20"/>
-          <w:szCs w:val="20"/>
-        </w:rPr>
-        <w:t>fonte do corpus.</w:t>
+        <w:t xml:space="preserve">   fonte do corpus.</w:t>
       </w:r>
     </w:p>
     <w:p>
@@ -9647,18 +9408,7 @@
           <w:sz w:val="20"/>
           <w:szCs w:val="20"/>
         </w:rPr>
-        <w:t xml:space="preserve">   </w:t>
-      </w:r>
-      <w:r>
-        <w:rPr>
-          <w:rFonts w:eastAsia="Consolas" w:cs="Consolas" w:ascii="Consolas" w:hAnsi="Consolas"/>
-          <w:i w:val="false"/>
-          <w:iCs w:val="false"/>
-          <w:color w:val="202020"/>
-          <w:sz w:val="20"/>
-          <w:szCs w:val="20"/>
-        </w:rPr>
-        <w:t>misturar com os blocos seguintes);</w:t>
+        <w:t xml:space="preserve">   misturar com os blocos seguintes);</w:t>
       </w:r>
     </w:p>
     <w:p>
@@ -9698,18 +9448,7 @@
           <w:sz w:val="20"/>
           <w:szCs w:val="20"/>
         </w:rPr>
-        <w:t xml:space="preserve">   </w:t>
-      </w:r>
-      <w:r>
-        <w:rPr>
-          <w:rFonts w:eastAsia="Consolas" w:cs="Consolas" w:ascii="Consolas" w:hAnsi="Consolas"/>
-          <w:i w:val="false"/>
-          <w:iCs w:val="false"/>
-          <w:color w:val="202020"/>
-          <w:sz w:val="20"/>
-          <w:szCs w:val="20"/>
-        </w:rPr>
-        <w:t>cada bloco.</w:t>
+        <w:t xml:space="preserve">   cada bloco.</w:t>
       </w:r>
     </w:p>
     <w:p>
@@ -10012,18 +9751,7 @@
           <w:sz w:val="20"/>
           <w:szCs w:val="20"/>
         </w:rPr>
-        <w:t xml:space="preserve">   </w:t>
-      </w:r>
-      <w:r>
-        <w:rPr>
-          <w:rFonts w:eastAsia="Consolas" w:cs="Consolas" w:ascii="Consolas" w:hAnsi="Consolas"/>
-          <w:i w:val="false"/>
-          <w:iCs w:val="false"/>
-          <w:color w:val="202020"/>
-          <w:sz w:val="20"/>
-          <w:szCs w:val="20"/>
-        </w:rPr>
-        <w:t>procedimentos;</w:t>
+        <w:t xml:space="preserve">   procedimentos;</w:t>
       </w:r>
     </w:p>
     <w:p>
@@ -10063,49 +9791,27 @@
           <w:sz w:val="20"/>
           <w:szCs w:val="20"/>
         </w:rPr>
-        <w:t xml:space="preserve">   </w:t>
-      </w:r>
-      <w:r>
-        <w:rPr>
-          <w:rFonts w:eastAsia="Consolas" w:cs="Consolas" w:ascii="Consolas" w:hAnsi="Consolas"/>
-          <w:i w:val="false"/>
-          <w:iCs w:val="false"/>
-          <w:color w:val="202020"/>
-          <w:sz w:val="20"/>
-          <w:szCs w:val="20"/>
-        </w:rPr>
-        <w:t>analisados (ex.: análise de conteúdo, análise de discurso,</w:t>
-      </w:r>
-    </w:p>
-    <w:p>
-      <w:pPr>
-        <w:pStyle w:val="Normal"/>
-        <w:shd w:val="clear" w:fill="F2F2F2"/>
-        <w:spacing w:before="0" w:after="0"/>
-        <w:ind w:start="200" w:end="200"/>
-        <w:rPr/>
-      </w:pPr>
-      <w:r>
-        <w:rPr>
-          <w:rFonts w:eastAsia="Consolas" w:cs="Consolas" w:ascii="Consolas" w:hAnsi="Consolas"/>
-          <w:i w:val="false"/>
-          <w:iCs w:val="false"/>
-          <w:color w:val="202020"/>
-          <w:sz w:val="20"/>
-          <w:szCs w:val="20"/>
-        </w:rPr>
-        <w:t xml:space="preserve">   </w:t>
-      </w:r>
-      <w:r>
-        <w:rPr>
-          <w:rFonts w:eastAsia="Consolas" w:cs="Consolas" w:ascii="Consolas" w:hAnsi="Consolas"/>
-          <w:i w:val="false"/>
-          <w:iCs w:val="false"/>
-          <w:color w:val="202020"/>
-          <w:sz w:val="20"/>
-          <w:szCs w:val="20"/>
-        </w:rPr>
-        <w:t>análise documental);</w:t>
+        <w:t xml:space="preserve">   analisados (ex.: análise de conteúdo, análise de discurso,</w:t>
+      </w:r>
+    </w:p>
+    <w:p>
+      <w:pPr>
+        <w:pStyle w:val="Normal"/>
+        <w:shd w:val="clear" w:fill="F2F2F2"/>
+        <w:spacing w:before="0" w:after="0"/>
+        <w:ind w:start="200" w:end="200"/>
+        <w:rPr/>
+      </w:pPr>
+      <w:r>
+        <w:rPr>
+          <w:rFonts w:eastAsia="Consolas" w:cs="Consolas" w:ascii="Consolas" w:hAnsi="Consolas"/>
+          <w:i w:val="false"/>
+          <w:iCs w:val="false"/>
+          <w:color w:val="202020"/>
+          <w:sz w:val="20"/>
+          <w:szCs w:val="20"/>
+        </w:rPr>
+        <w:t xml:space="preserve">   análise documental);</w:t>
       </w:r>
     </w:p>
     <w:p>
@@ -10145,18 +9851,7 @@
           <w:sz w:val="20"/>
           <w:szCs w:val="20"/>
         </w:rPr>
-        <w:t xml:space="preserve">   </w:t>
-      </w:r>
-      <w:r>
-        <w:rPr>
-          <w:rFonts w:eastAsia="Consolas" w:cs="Consolas" w:ascii="Consolas" w:hAnsi="Consolas"/>
-          <w:i w:val="false"/>
-          <w:iCs w:val="false"/>
-          <w:color w:val="202020"/>
-          <w:sz w:val="20"/>
-          <w:szCs w:val="20"/>
-        </w:rPr>
-        <w:t>teórico já definido.</w:t>
+        <w:t xml:space="preserve">   teórico já definido.</w:t>
       </w:r>
     </w:p>
     <w:p>
@@ -11506,18 +11201,7 @@
           <w:sz w:val="20"/>
           <w:szCs w:val="20"/>
         </w:rPr>
-        <w:t xml:space="preserve">  </w:t>
-      </w:r>
-      <w:r>
-        <w:rPr>
-          <w:rFonts w:eastAsia="Consolas" w:cs="Consolas" w:ascii="Consolas" w:hAnsi="Consolas"/>
-          <w:i w:val="false"/>
-          <w:iCs w:val="false"/>
-          <w:color w:val="202020"/>
-          <w:sz w:val="20"/>
-          <w:szCs w:val="20"/>
-        </w:rPr>
-        <w:t>corrido analítico;</w:t>
+        <w:t xml:space="preserve">  corrido analítico;</w:t>
       </w:r>
     </w:p>
     <w:p>
@@ -11577,18 +11261,7 @@
           <w:sz w:val="20"/>
           <w:szCs w:val="20"/>
         </w:rPr>
-        <w:t xml:space="preserve">  </w:t>
-      </w:r>
-      <w:r>
-        <w:rPr>
-          <w:rFonts w:eastAsia="Consolas" w:cs="Consolas" w:ascii="Consolas" w:hAnsi="Consolas"/>
-          <w:i w:val="false"/>
-          <w:iCs w:val="false"/>
-          <w:color w:val="202020"/>
-          <w:sz w:val="20"/>
-          <w:szCs w:val="20"/>
-        </w:rPr>
-        <w:t>apenas organizar, separar, comparar ou mapear;</w:t>
+        <w:t xml:space="preserve">  apenas organizar, separar, comparar ou mapear;</w:t>
       </w:r>
     </w:p>
     <w:p>
@@ -11628,18 +11301,7 @@
           <w:sz w:val="20"/>
           <w:szCs w:val="20"/>
         </w:rPr>
-        <w:t xml:space="preserve">  </w:t>
-      </w:r>
-      <w:r>
-        <w:rPr>
-          <w:rFonts w:eastAsia="Consolas" w:cs="Consolas" w:ascii="Consolas" w:hAnsi="Consolas"/>
-          <w:i w:val="false"/>
-          <w:iCs w:val="false"/>
-          <w:color w:val="202020"/>
-          <w:sz w:val="20"/>
-          <w:szCs w:val="20"/>
-        </w:rPr>
-        <w:t>ou em uma IA generalista (cruzamento entre fontes já extraídas);</w:t>
+        <w:t xml:space="preserve">  ou em uma IA generalista (cruzamento entre fontes já extraídas);</w:t>
       </w:r>
     </w:p>
     <w:p>
@@ -11679,18 +11341,7 @@
           <w:sz w:val="20"/>
           <w:szCs w:val="20"/>
         </w:rPr>
-        <w:t xml:space="preserve">  </w:t>
-      </w:r>
-      <w:r>
-        <w:rPr>
-          <w:rFonts w:eastAsia="Consolas" w:cs="Consolas" w:ascii="Consolas" w:hAnsi="Consolas"/>
-          <w:i w:val="false"/>
-          <w:iCs w:val="false"/>
-          <w:color w:val="202020"/>
-          <w:sz w:val="20"/>
-          <w:szCs w:val="20"/>
-        </w:rPr>
-        <w:t>campos entre colchetes [ ] para o que for variável).</w:t>
+        <w:t xml:space="preserve">  campos entre colchetes [ ] para o que for variável).</w:t>
       </w:r>
     </w:p>
     <w:p>
@@ -11940,15 +11591,7 @@
                 <w:bCs w:val="false"/>
                 <w:color w:val="000000"/>
               </w:rPr>
-              <w:t xml:space="preserve">— </w:t>
-            </w:r>
-            <w:r>
-              <w:rPr>
-                <w:b w:val="false"/>
-                <w:bCs w:val="false"/>
-                <w:color w:val="000000"/>
-              </w:rPr>
-              <w:t>(organização manual dos eixos)</w:t>
+              <w:t xml:space="preserve">— (organização manual dos eixos)</w:t>
             </w:r>
           </w:p>
         </w:tc>
@@ -12327,15 +11970,7 @@
                 <w:bCs w:val="false"/>
                 <w:color w:val="000000"/>
               </w:rPr>
-              <w:t xml:space="preserve">— </w:t>
-            </w:r>
-            <w:r>
-              <w:rPr>
-                <w:b w:val="false"/>
-                <w:bCs w:val="false"/>
-                <w:color w:val="000000"/>
-              </w:rPr>
-              <w:t>(escrita autoral)</w:t>
+              <w:t xml:space="preserve">— (escrita autoral)</w:t>
             </w:r>
           </w:p>
         </w:tc>
@@ -12534,18 +12169,7 @@
           <w:sz w:val="20"/>
           <w:szCs w:val="20"/>
         </w:rPr>
-        <w:t xml:space="preserve">    </w:t>
-      </w:r>
-      <w:r>
-        <w:rPr>
-          <w:rFonts w:eastAsia="Consolas" w:cs="Consolas" w:ascii="Consolas" w:hAnsi="Consolas"/>
-          <w:i w:val="false"/>
-          <w:iCs w:val="false"/>
-          <w:color w:val="202020"/>
-          <w:sz w:val="20"/>
-          <w:szCs w:val="20"/>
-        </w:rPr>
-        <w:t>Painel-Projeto.md          (nota central — o "painel de controle")</w:t>
+        <w:t xml:space="preserve">    Painel-Projeto.md          (nota central — o "painel de controle")</w:t>
       </w:r>
     </w:p>
     <w:p>
@@ -12597,18 +12221,7 @@
           <w:sz w:val="20"/>
           <w:szCs w:val="20"/>
         </w:rPr>
-        <w:t xml:space="preserve">    </w:t>
-      </w:r>
-      <w:r>
-        <w:rPr>
-          <w:rFonts w:eastAsia="Consolas" w:cs="Consolas" w:ascii="Consolas" w:hAnsi="Consolas"/>
-          <w:i w:val="false"/>
-          <w:iCs w:val="false"/>
-          <w:color w:val="202020"/>
-          <w:sz w:val="20"/>
-          <w:szCs w:val="20"/>
-        </w:rPr>
-        <w:t>Fichamentos/                (uma nota por fonte lida)</w:t>
+        <w:t xml:space="preserve">    Fichamentos/                (uma nota por fonte lida)</w:t>
       </w:r>
     </w:p>
     <w:p>
@@ -12660,18 +12273,7 @@
           <w:sz w:val="20"/>
           <w:szCs w:val="20"/>
         </w:rPr>
-        <w:t xml:space="preserve">    </w:t>
-      </w:r>
-      <w:r>
-        <w:rPr>
-          <w:rFonts w:eastAsia="Consolas" w:cs="Consolas" w:ascii="Consolas" w:hAnsi="Consolas"/>
-          <w:i w:val="false"/>
-          <w:iCs w:val="false"/>
-          <w:color w:val="202020"/>
-          <w:sz w:val="20"/>
-          <w:szCs w:val="20"/>
-        </w:rPr>
-        <w:t>Fichamentos/</w:t>
+        <w:t xml:space="preserve">    Fichamentos/</w:t>
       </w:r>
     </w:p>
     <w:p>
@@ -12723,18 +12325,7 @@
           <w:sz w:val="20"/>
           <w:szCs w:val="20"/>
         </w:rPr>
-        <w:t xml:space="preserve">    </w:t>
-      </w:r>
-      <w:r>
-        <w:rPr>
-          <w:rFonts w:eastAsia="Consolas" w:cs="Consolas" w:ascii="Consolas" w:hAnsi="Consolas"/>
-          <w:i w:val="false"/>
-          <w:iCs w:val="false"/>
-          <w:color w:val="202020"/>
-          <w:sz w:val="20"/>
-          <w:szCs w:val="20"/>
-        </w:rPr>
-        <w:t>(uma nota por conceito-chave, cruzando todos os eixos)</w:t>
+        <w:t xml:space="preserve">    (uma nota por conceito-chave, cruzando todos os eixos)</w:t>
       </w:r>
     </w:p>
     <w:p>
@@ -12786,18 +12377,7 @@
           <w:sz w:val="20"/>
           <w:szCs w:val="20"/>
         </w:rPr>
-        <w:t xml:space="preserve">    </w:t>
-      </w:r>
-      <w:r>
-        <w:rPr>
-          <w:rFonts w:eastAsia="Consolas" w:cs="Consolas" w:ascii="Consolas" w:hAnsi="Consolas"/>
-          <w:i w:val="false"/>
-          <w:iCs w:val="false"/>
-          <w:color w:val="202020"/>
-          <w:sz w:val="20"/>
-          <w:szCs w:val="20"/>
-        </w:rPr>
-        <w:t>(colar aqui as saídas dos prompts A, B, C — organizadas por eixo)</w:t>
+        <w:t xml:space="preserve">    (colar aqui as saídas dos prompts A, B, C — organizadas por eixo)</w:t>
       </w:r>
     </w:p>
     <w:p>
@@ -12849,18 +12429,7 @@
           <w:sz w:val="20"/>
           <w:szCs w:val="20"/>
         </w:rPr>
-        <w:t xml:space="preserve">    </w:t>
-      </w:r>
-      <w:r>
-        <w:rPr>
-          <w:rFonts w:eastAsia="Consolas" w:cs="Consolas" w:ascii="Consolas" w:hAnsi="Consolas"/>
-          <w:i w:val="false"/>
-          <w:iCs w:val="false"/>
-          <w:color w:val="202020"/>
-          <w:sz w:val="20"/>
-          <w:szCs w:val="20"/>
-        </w:rPr>
-        <w:t>(rascunhos, estrutura do Prompt D2, versões do texto)</w:t>
+        <w:t xml:space="preserve">    (rascunhos, estrutura do Prompt D2, versões do texto)</w:t>
       </w:r>
     </w:p>
     <w:p>
@@ -14170,15 +13739,7 @@
           <w:bCs/>
           <w:color w:val="FFFFFF"/>
         </w:rPr>
-        <w:t xml:space="preserve">  </w:t>
-      </w:r>
-      <w:r>
-        <w:rPr>
-          <w:b/>
-          <w:bCs/>
-          <w:color w:val="FFFFFF"/>
-        </w:rPr>
-        <w:t xml:space="preserve">EXEMPLO / MOCK ILUSTRATIVO  </w:t>
+        <w:t xml:space="preserve">  EXEMPLO / MOCK ILUSTRATIVO  </w:t>
       </w:r>
     </w:p>
     <w:p>

</xml_diff>